<commit_message>
correct v2 file uploaded with responses
</commit_message>
<xml_diff>
--- a/1st Deliverable Documents/Use Case Diagram/Use-Case Diagram Feedback (First Half) v2.docx
+++ b/1st Deliverable Documents/Use Case Diagram/Use-Case Diagram Feedback (First Half) v2.docx
@@ -332,21 +332,7 @@
         <w:rPr>
           <w:color w:val="FF4000"/>
         </w:rPr>
-        <w:t xml:space="preserve">Only admin can create account. And </w:t>
-      </w:r>
-      <w:proofErr w:type="spellStart"/>
-      <w:r>
-        <w:rPr>
-          <w:color w:val="FF4000"/>
-        </w:rPr>
-        <w:t>is</w:t>
-      </w:r>
-      <w:proofErr w:type="spellEnd"/>
-      <w:r>
-        <w:rPr>
-          <w:color w:val="FF4000"/>
-        </w:rPr>
-        <w:t xml:space="preserve"> says pharmacist can access everything except the USER class</w:t>
+        <w:t>Only admin can create account. And is says pharmacist can access everything except the USER class</w:t>
       </w:r>
       <w:r>
         <w:rPr>
@@ -390,21 +376,7 @@
         <w:rPr>
           <w:color w:val="81D41A"/>
         </w:rPr>
-        <w:t xml:space="preserve">Customers are the account holder and the </w:t>
-      </w:r>
-      <w:proofErr w:type="gramStart"/>
-      <w:r>
-        <w:rPr>
-          <w:color w:val="81D41A"/>
-        </w:rPr>
-        <w:t>one off</w:t>
-      </w:r>
-      <w:proofErr w:type="gramEnd"/>
-      <w:r>
-        <w:rPr>
-          <w:color w:val="81D41A"/>
-        </w:rPr>
-        <w:t xml:space="preserve"> customer actors.</w:t>
+        <w:t>Customers are the account holder and the one off customer actors.</w:t>
       </w:r>
     </w:p>
     <w:p/>
@@ -418,14 +390,14 @@
         <w:rPr>
           <w:b/>
           <w:bCs/>
-          <w:color w:val="92D050"/>
-        </w:rPr>
-      </w:pPr>
-      <w:r>
-        <w:rPr>
-          <w:b/>
-          <w:bCs/>
-          <w:color w:val="92D050"/>
+          <w:color w:val="000000" w:themeColor="text1"/>
+        </w:rPr>
+      </w:pPr>
+      <w:r>
+        <w:rPr>
+          <w:b/>
+          <w:bCs/>
+          <w:color w:val="000000" w:themeColor="text1"/>
         </w:rPr>
         <w:t>View Account Status (Use case)</w:t>
       </w:r>
@@ -484,19 +456,11 @@
           <w:color w:val="81D41A"/>
         </w:rPr>
       </w:pPr>
-      <w:proofErr w:type="gramStart"/>
       <w:r>
         <w:rPr>
           <w:color w:val="81D41A"/>
         </w:rPr>
-        <w:t>Yes</w:t>
-      </w:r>
-      <w:proofErr w:type="gramEnd"/>
-      <w:r>
-        <w:rPr>
-          <w:color w:val="81D41A"/>
-        </w:rPr>
-        <w:t xml:space="preserve"> makes sense</w:t>
+        <w:t>Yes makes sense</w:t>
       </w:r>
     </w:p>
     <w:p/>
@@ -564,15 +528,7 @@
         </w:numPr>
       </w:pPr>
       <w:r>
-        <w:t xml:space="preserve">The ‘Pharmacist’ is the primary actor for both </w:t>
-      </w:r>
-      <w:proofErr w:type="gramStart"/>
-      <w:r>
-        <w:t>use</w:t>
-      </w:r>
-      <w:proofErr w:type="gramEnd"/>
-      <w:r>
-        <w:t xml:space="preserve"> cases. </w:t>
+        <w:t xml:space="preserve">The ‘Pharmacist’ is the primary actor for both use cases. </w:t>
       </w:r>
     </w:p>
     <w:p>
@@ -608,94 +564,60 @@
           <w:color w:val="00B0F0"/>
         </w:rPr>
       </w:pPr>
-      <w:proofErr w:type="gramStart"/>
       <w:r>
         <w:rPr>
           <w:color w:val="FF4000"/>
         </w:rPr>
-        <w:t>Yeah</w:t>
-      </w:r>
-      <w:proofErr w:type="gramEnd"/>
+        <w:t>Yeah the system generates it but</w:t>
+      </w:r>
+      <w:r>
+        <w:rPr>
+          <w:color w:val="81D41A"/>
+        </w:rPr>
+        <w:t xml:space="preserve"> </w:t>
+      </w:r>
       <w:r>
         <w:rPr>
           <w:color w:val="FF4000"/>
         </w:rPr>
-        <w:t xml:space="preserve"> the system generates </w:t>
-      </w:r>
-      <w:proofErr w:type="gramStart"/>
-      <w:r>
-        <w:rPr>
-          <w:color w:val="FF4000"/>
-        </w:rPr>
-        <w:t>it</w:t>
-      </w:r>
-      <w:proofErr w:type="gramEnd"/>
-      <w:r>
-        <w:rPr>
-          <w:color w:val="FF4000"/>
-        </w:rPr>
-        <w:t xml:space="preserve"> but</w:t>
+        <w:t xml:space="preserve">it says the pharmacist is the one who initiates the report. As it says ‘system allow the merchant to produce two reminders’. </w:t>
       </w:r>
       <w:r>
         <w:rPr>
           <w:color w:val="81D41A"/>
         </w:rPr>
+        <w:t>But yes the pharmacist only needs access to one of the 2 cases.</w:t>
+      </w:r>
+      <w:r>
+        <w:rPr>
+          <w:color w:val="81D41A"/>
+        </w:rPr>
         <w:t xml:space="preserve"> </w:t>
       </w:r>
       <w:r>
         <w:rPr>
-          <w:color w:val="FF4000"/>
-        </w:rPr>
-        <w:t xml:space="preserve">it says the pharmacist is the one who initiates the report. As it says ‘system allow the merchant to produce two </w:t>
-      </w:r>
-      <w:proofErr w:type="gramStart"/>
-      <w:r>
-        <w:rPr>
-          <w:color w:val="FF4000"/>
-        </w:rPr>
-        <w:t>reminders’</w:t>
-      </w:r>
-      <w:proofErr w:type="gramEnd"/>
-      <w:r>
-        <w:rPr>
-          <w:color w:val="FF4000"/>
-        </w:rPr>
-        <w:t xml:space="preserve">. </w:t>
-      </w:r>
-      <w:r>
-        <w:rPr>
-          <w:color w:val="81D41A"/>
-        </w:rPr>
-        <w:t xml:space="preserve">But </w:t>
-      </w:r>
-      <w:proofErr w:type="gramStart"/>
-      <w:r>
-        <w:rPr>
-          <w:color w:val="81D41A"/>
-        </w:rPr>
-        <w:t>yes</w:t>
-      </w:r>
-      <w:proofErr w:type="gramEnd"/>
-      <w:r>
-        <w:rPr>
-          <w:color w:val="81D41A"/>
-        </w:rPr>
-        <w:t xml:space="preserve"> the pharmacist only needs access to one of the 2 cases.</w:t>
-      </w:r>
-      <w:r>
-        <w:rPr>
-          <w:color w:val="81D41A"/>
+          <w:color w:val="00B0F0"/>
+        </w:rPr>
+        <w:sym w:font="Wingdings" w:char="F0E0"/>
+      </w:r>
+      <w:r>
+        <w:rPr>
+          <w:color w:val="00B0F0"/>
         </w:rPr>
         <w:t xml:space="preserve"> </w:t>
       </w:r>
       <w:r>
         <w:rPr>
+          <w:i/>
+          <w:iCs/>
           <w:color w:val="00B0F0"/>
         </w:rPr>
-        <w:sym w:font="Wingdings" w:char="F0E0"/>
-      </w:r>
-      <w:r>
-        <w:rPr>
+        <w:t>Response:</w:t>
+      </w:r>
+      <w:r>
+        <w:rPr>
+          <w:i/>
+          <w:iCs/>
           <w:color w:val="00B0F0"/>
         </w:rPr>
         <w:t xml:space="preserve"> </w:t>
@@ -706,29 +628,7 @@
           <w:iCs/>
           <w:color w:val="00B0F0"/>
         </w:rPr>
-        <w:t>Response:</w:t>
-      </w:r>
-      <w:r>
-        <w:rPr>
-          <w:i/>
-          <w:iCs/>
-          <w:color w:val="00B0F0"/>
-        </w:rPr>
-        <w:t xml:space="preserve"> H</w:t>
-      </w:r>
-      <w:r>
-        <w:rPr>
-          <w:i/>
-          <w:iCs/>
-          <w:color w:val="00B0F0"/>
-        </w:rPr>
-        <w:t>ave ‘Manager’ as an actor for this use case, since the ‘Manager’ is responsible for handling financial reports and debt collection.</w:t>
-      </w:r>
-      <w:r>
-        <w:rPr>
-          <w:color w:val="00B0F0"/>
-        </w:rPr>
-        <w:t xml:space="preserve"> </w:t>
+        <w:t xml:space="preserve">Since the reminder is generated by the IPOS-CA, best to include a note with an explanation. </w:t>
       </w:r>
     </w:p>
     <w:p/>
@@ -782,37 +682,45 @@
       <w:r>
         <w:t xml:space="preserve"> Manager’. </w:t>
       </w:r>
-      <w:proofErr w:type="gramStart"/>
       <w:r>
         <w:rPr>
           <w:color w:val="FF0000"/>
         </w:rPr>
-        <w:t>Actually</w:t>
-      </w:r>
-      <w:proofErr w:type="gramEnd"/>
+        <w:t>Actually its neither, it says IPOS-CA should maintain automatically the status of an account. So not sure how we show that, maybe via a comment attached to it, because how do we explain the system as an actor.</w:t>
+      </w:r>
       <w:r>
         <w:rPr>
           <w:color w:val="FF0000"/>
         </w:rPr>
-        <w:t xml:space="preserve"> its neither, it says IPOS-CA should maintain automatically the status of an account. So not sure how we show that, maybe via a comment attached to it, because how do we explain the system as an actor.</w:t>
+        <w:t xml:space="preserve"> </w:t>
       </w:r>
       <w:r>
         <w:rPr>
           <w:color w:val="FF0000"/>
         </w:rPr>
+        <w:sym w:font="Wingdings" w:char="F0E0"/>
+      </w:r>
+      <w:r>
+        <w:rPr>
+          <w:i/>
+          <w:iCs/>
+          <w:color w:val="FF0000"/>
+        </w:rPr>
         <w:t xml:space="preserve"> </w:t>
       </w:r>
       <w:r>
         <w:rPr>
-          <w:color w:val="FF0000"/>
-        </w:rPr>
-        <w:sym w:font="Wingdings" w:char="F0E0"/>
-      </w:r>
-      <w:r>
-        <w:rPr>
-          <w:i/>
-          <w:iCs/>
-          <w:color w:val="FF0000"/>
+          <w:i/>
+          <w:iCs/>
+          <w:color w:val="00B0F0"/>
+        </w:rPr>
+        <w:t>Response:</w:t>
+      </w:r>
+      <w:r>
+        <w:rPr>
+          <w:i/>
+          <w:iCs/>
+          <w:color w:val="00B0F0"/>
         </w:rPr>
         <w:t xml:space="preserve"> </w:t>
       </w:r>
@@ -822,57 +730,7 @@
           <w:iCs/>
           <w:color w:val="00B0F0"/>
         </w:rPr>
-        <w:t>Response:</w:t>
-      </w:r>
-      <w:r>
-        <w:rPr>
-          <w:i/>
-          <w:iCs/>
-          <w:color w:val="00B0F0"/>
-        </w:rPr>
-        <w:t xml:space="preserve"> Managers are responsible for overseeing account suspensions and reactivations.</w:t>
-      </w:r>
-      <w:r>
-        <w:rPr>
-          <w:i/>
-          <w:iCs/>
-          <w:color w:val="00B0F0"/>
-        </w:rPr>
-        <w:t xml:space="preserve"> </w:t>
-      </w:r>
-      <w:proofErr w:type="gramStart"/>
-      <w:r>
-        <w:rPr>
-          <w:i/>
-          <w:iCs/>
-          <w:color w:val="00B0F0"/>
-        </w:rPr>
-        <w:t>I</w:t>
-      </w:r>
-      <w:proofErr w:type="gramEnd"/>
-      <w:r>
-        <w:rPr>
-          <w:i/>
-          <w:iCs/>
-          <w:color w:val="00B0F0"/>
-        </w:rPr>
-        <w:t xml:space="preserve"> can</w:t>
-      </w:r>
-      <w:r>
-        <w:rPr>
-          <w:i/>
-          <w:iCs/>
-          <w:color w:val="00B0F0"/>
-        </w:rPr>
-        <w:t xml:space="preserve"> attach a comment with a valid explanation</w:t>
-      </w:r>
-      <w:r>
-        <w:rPr>
-          <w:i/>
-          <w:iCs/>
-          <w:color w:val="00B0F0"/>
-        </w:rPr>
-        <w:t xml:space="preserve"> to maintain automatically the status of an account. </w:t>
+        <w:t xml:space="preserve">IPOS-CA is supposed to update the status of the account, so the association between ‘Pharmacist’ and ‘Update Account Status’ will be removed, and a note will be attached with an explanation. </w:t>
       </w:r>
     </w:p>
     <w:p>
@@ -949,93 +807,7 @@
         <w:rPr>
           <w:color w:val="FF0000"/>
         </w:rPr>
-        <w:t xml:space="preserve">Accept payment is part of the SALE functionality, for the CUST functionality. </w:t>
-      </w:r>
-      <w:proofErr w:type="gramStart"/>
-      <w:r>
-        <w:rPr>
-          <w:color w:val="FF0000"/>
-        </w:rPr>
-        <w:t>So</w:t>
-      </w:r>
-      <w:proofErr w:type="gramEnd"/>
-      <w:r>
-        <w:rPr>
-          <w:color w:val="FF0000"/>
-        </w:rPr>
-        <w:t xml:space="preserve"> should they interlink? Record account payment is </w:t>
-      </w:r>
-      <w:proofErr w:type="gramStart"/>
-      <w:r>
-        <w:rPr>
-          <w:color w:val="FF0000"/>
-        </w:rPr>
-        <w:t>create</w:t>
-      </w:r>
-      <w:proofErr w:type="gramEnd"/>
-      <w:r>
-        <w:rPr>
-          <w:color w:val="FF0000"/>
-        </w:rPr>
-        <w:t xml:space="preserve"> like a log, the payment </w:t>
-      </w:r>
-      <w:proofErr w:type="spellStart"/>
-      <w:r>
-        <w:rPr>
-          <w:color w:val="FF0000"/>
-        </w:rPr>
-        <w:t>isnt</w:t>
-      </w:r>
-      <w:proofErr w:type="spellEnd"/>
-      <w:r>
-        <w:rPr>
-          <w:color w:val="FF0000"/>
-        </w:rPr>
-        <w:t xml:space="preserve"> made, </w:t>
-      </w:r>
-      <w:proofErr w:type="spellStart"/>
-      <w:proofErr w:type="gramStart"/>
-      <w:r>
-        <w:rPr>
-          <w:color w:val="FF0000"/>
-        </w:rPr>
-        <w:t>its</w:t>
-      </w:r>
-      <w:proofErr w:type="spellEnd"/>
-      <w:proofErr w:type="gramEnd"/>
-      <w:r>
-        <w:rPr>
-          <w:color w:val="FF0000"/>
-        </w:rPr>
-        <w:t xml:space="preserve"> like the balance is taken from their credit and </w:t>
-      </w:r>
-      <w:proofErr w:type="spellStart"/>
-      <w:r>
-        <w:rPr>
-          <w:color w:val="FF0000"/>
-        </w:rPr>
-        <w:t>its</w:t>
-      </w:r>
-      <w:proofErr w:type="spellEnd"/>
-      <w:r>
-        <w:rPr>
-          <w:color w:val="FF0000"/>
-        </w:rPr>
-        <w:t xml:space="preserve"> like in an </w:t>
-      </w:r>
-      <w:proofErr w:type="gramStart"/>
-      <w:r>
-        <w:rPr>
-          <w:color w:val="FF0000"/>
-        </w:rPr>
-        <w:t>on hold</w:t>
-      </w:r>
-      <w:proofErr w:type="gramEnd"/>
-      <w:r>
-        <w:rPr>
-          <w:color w:val="FF0000"/>
-        </w:rPr>
-        <w:t xml:space="preserve"> state. Let me know if I can explain it better</w:t>
+        <w:t>Accept payment is part of the SALE functionality, for the CUST functionality. So should they interlink? Record account payment is create like a log, the payment isnt made, its like the balance is taken from their credit and its like in an on hold state. Let me know if I can explain it better</w:t>
       </w:r>
       <w:r>
         <w:rPr>
@@ -1083,12 +855,14 @@
         <w:rPr>
           <w:b/>
           <w:bCs/>
-        </w:rPr>
-      </w:pPr>
-      <w:r>
-        <w:rPr>
-          <w:b/>
-          <w:bCs/>
+          <w:color w:val="000000" w:themeColor="text1"/>
+        </w:rPr>
+      </w:pPr>
+      <w:r>
+        <w:rPr>
+          <w:b/>
+          <w:bCs/>
+          <w:color w:val="000000" w:themeColor="text1"/>
         </w:rPr>
         <w:t>Generate Receipt/Invoice (Use Case)</w:t>
       </w:r>
@@ -1202,25 +976,20 @@
           <w:iCs/>
           <w:color w:val="00B0F0"/>
         </w:rPr>
-        <w:t>Best possible approach is to have ‘Record Sale &lt;&lt;include&gt;&gt; Generate Receipt/Invoice’.</w:t>
-      </w:r>
-      <w:r>
-        <w:rPr>
-          <w:color w:val="81D41A"/>
-        </w:rPr>
-        <w:t xml:space="preserve">  </w:t>
-      </w:r>
-    </w:p>
-    <w:p>
-      <w:pPr>
-        <w:pStyle w:val="ListParagraph"/>
-        <w:rPr>
-          <w:color w:val="81D41A"/>
-        </w:rPr>
-      </w:pPr>
-    </w:p>
-    <w:p>
-      <w:pPr>
+        <w:t>Best possible approach is to have ‘Record Sale &lt;&lt;include&gt;&gt; Generate Receipt/Invoice’</w:t>
+      </w:r>
+      <w:r>
+        <w:rPr>
+          <w:i/>
+          <w:iCs/>
+          <w:color w:val="00B0F0"/>
+        </w:rPr>
+        <w:t xml:space="preserve"> and removing the association between ‘Record Sale’ and the ‘Pharmacist’. </w:t>
+      </w:r>
+    </w:p>
+    <w:p>
+      <w:pPr>
+        <w:pStyle w:val="ListParagraph"/>
         <w:rPr>
           <w:color w:val="81D41A"/>
         </w:rPr>
@@ -1244,19 +1013,24 @@
         <w:rPr>
           <w:b/>
           <w:bCs/>
-        </w:rPr>
-      </w:pPr>
-      <w:r>
-        <w:rPr>
-          <w:b/>
-          <w:bCs/>
-        </w:rPr>
-        <w:t>Description</w:t>
-      </w:r>
-    </w:p>
-    <w:p>
-      <w:pPr>
-        <w:pStyle w:val="ListParagraph"/>
+          <w:color w:val="000000" w:themeColor="text1"/>
+        </w:rPr>
+      </w:pPr>
+      <w:r>
+        <w:rPr>
+          <w:b/>
+          <w:bCs/>
+          <w:color w:val="000000" w:themeColor="text1"/>
+        </w:rPr>
+        <w:t>Actors Placement Within Diagram</w:t>
+      </w:r>
+    </w:p>
+    <w:p>
+      <w:pPr>
+        <w:pStyle w:val="ListParagraph"/>
+        <w:rPr>
+          <w:color w:val="81D41A"/>
+        </w:rPr>
       </w:pPr>
     </w:p>
     <w:p>
@@ -1266,9 +1040,15 @@
           <w:ilvl w:val="0"/>
           <w:numId w:val="2"/>
         </w:numPr>
-      </w:pPr>
-      <w:r>
-        <w:t>Best to provide a description at the bottom of the use case diagram.</w:t>
+        <w:rPr>
+          <w:color w:val="000000" w:themeColor="text1"/>
+        </w:rPr>
+      </w:pPr>
+      <w:r>
+        <w:rPr>
+          <w:color w:val="000000" w:themeColor="text1"/>
+        </w:rPr>
+        <w:t xml:space="preserve">Best to place external actors on a separate side to other actors.  </w:t>
       </w:r>
     </w:p>
     <w:p>
@@ -1278,6 +1058,107 @@
           <w:ilvl w:val="0"/>
           <w:numId w:val="2"/>
         </w:numPr>
+        <w:rPr>
+          <w:color w:val="000000" w:themeColor="text1"/>
+        </w:rPr>
+      </w:pPr>
+      <w:r>
+        <w:rPr>
+          <w:color w:val="000000" w:themeColor="text1"/>
+        </w:rPr>
+        <w:t>E.g.</w:t>
+      </w:r>
+      <w:r>
+        <w:rPr>
+          <w:color w:val="000000" w:themeColor="text1"/>
+        </w:rPr>
+        <w:t>, IPOS</w:t>
+      </w:r>
+      <w:r>
+        <w:rPr>
+          <w:color w:val="000000" w:themeColor="text1"/>
+        </w:rPr>
+        <w:t xml:space="preserve">-SA should be on </w:t>
+      </w:r>
+      <w:r>
+        <w:rPr>
+          <w:color w:val="000000" w:themeColor="text1"/>
+        </w:rPr>
+        <w:t>right-side,</w:t>
+      </w:r>
+      <w:r>
+        <w:rPr>
+          <w:color w:val="000000" w:themeColor="text1"/>
+        </w:rPr>
+        <w:t xml:space="preserve"> </w:t>
+      </w:r>
+      <w:r>
+        <w:rPr>
+          <w:color w:val="000000" w:themeColor="text1"/>
+        </w:rPr>
+        <w:t xml:space="preserve">and ‘Customer’ should be on left side. </w:t>
+      </w:r>
+    </w:p>
+    <w:p>
+      <w:pPr>
+        <w:pStyle w:val="ListParagraph"/>
+        <w:rPr>
+          <w:color w:val="81D41A"/>
+        </w:rPr>
+      </w:pPr>
+    </w:p>
+    <w:p>
+      <w:pPr>
+        <w:pStyle w:val="ListParagraph"/>
+        <w:rPr>
+          <w:color w:val="81D41A"/>
+        </w:rPr>
+      </w:pPr>
+    </w:p>
+    <w:p>
+      <w:pPr>
+        <w:pStyle w:val="ListParagraph"/>
+        <w:numPr>
+          <w:ilvl w:val="0"/>
+          <w:numId w:val="1"/>
+        </w:numPr>
+        <w:rPr>
+          <w:b/>
+          <w:bCs/>
+        </w:rPr>
+      </w:pPr>
+      <w:r>
+        <w:rPr>
+          <w:b/>
+          <w:bCs/>
+        </w:rPr>
+        <w:t>Description</w:t>
+      </w:r>
+    </w:p>
+    <w:p>
+      <w:pPr>
+        <w:pStyle w:val="ListParagraph"/>
+      </w:pPr>
+    </w:p>
+    <w:p>
+      <w:pPr>
+        <w:pStyle w:val="ListParagraph"/>
+        <w:numPr>
+          <w:ilvl w:val="0"/>
+          <w:numId w:val="2"/>
+        </w:numPr>
+      </w:pPr>
+      <w:r>
+        <w:t>Best to provide a description at the bottom of the use case diagram.</w:t>
+      </w:r>
+    </w:p>
+    <w:p>
+      <w:pPr>
+        <w:pStyle w:val="ListParagraph"/>
+        <w:numPr>
+          <w:ilvl w:val="0"/>
+          <w:numId w:val="2"/>
+        </w:numPr>
       </w:pPr>
       <w:r>
         <w:t xml:space="preserve">This can either involve describing what each use case means or having a small paragraph which shows the different interactions taking place within the use case diagram. </w:t>
@@ -1290,40 +1171,32 @@
           <w:color w:val="81D41A"/>
         </w:rPr>
       </w:pPr>
-      <w:proofErr w:type="gramStart"/>
       <w:r>
         <w:rPr>
           <w:color w:val="81D41A"/>
         </w:rPr>
-        <w:t>Yes</w:t>
-      </w:r>
-      <w:proofErr w:type="gramEnd"/>
+        <w:t>Yes we can make a brief description explaining how its structured.</w:t>
+      </w:r>
       <w:r>
         <w:rPr>
           <w:color w:val="81D41A"/>
         </w:rPr>
-        <w:t xml:space="preserve"> we can make a brief description explaining how its structured.</w:t>
+        <w:t xml:space="preserve"> </w:t>
       </w:r>
       <w:r>
         <w:rPr>
           <w:color w:val="81D41A"/>
         </w:rPr>
+        <w:sym w:font="Wingdings" w:char="F0E0"/>
+      </w:r>
+      <w:r>
+        <w:rPr>
+          <w:color w:val="81D41A"/>
+        </w:rPr>
         <w:t xml:space="preserve"> </w:t>
       </w:r>
       <w:r>
         <w:rPr>
-          <w:color w:val="81D41A"/>
-        </w:rPr>
-        <w:sym w:font="Wingdings" w:char="F0E0"/>
-      </w:r>
-      <w:r>
-        <w:rPr>
-          <w:color w:val="81D41A"/>
-        </w:rPr>
-        <w:t xml:space="preserve"> </w:t>
-      </w:r>
-      <w:r>
-        <w:rPr>
           <w:i/>
           <w:iCs/>
           <w:color w:val="00B0F0"/>
@@ -1331,10 +1204,6 @@
         <w:t>Response: Will be done.</w:t>
       </w:r>
     </w:p>
-    <w:p/>
-    <w:p/>
-    <w:p/>
-    <w:p/>
     <w:p>
       <w:pPr>
         <w:rPr>
@@ -1365,7 +1234,7 @@
           <w:i/>
           <w:iCs/>
         </w:rPr>
-        <w:t xml:space="preserve">More feedback will be provided soon. </w:t>
+        <w:t xml:space="preserve">All feedback provided. </w:t>
       </w:r>
     </w:p>
     <w:p>
@@ -1395,23 +1264,45 @@
           <w:i/>
           <w:iCs/>
         </w:rPr>
-        <w:t xml:space="preserve">Responses have been provided by Sukhmanvir Atwal on 08/02/2026. </w:t>
-      </w:r>
-    </w:p>
-    <w:p>
-      <w:pPr>
-        <w:rPr>
-          <w:i/>
-          <w:iCs/>
-        </w:rPr>
-      </w:pPr>
-      <w:r>
-        <w:rPr>
-          <w:i/>
-          <w:iCs/>
-        </w:rPr>
-        <w:t xml:space="preserve">More than two responses were given, suggesting different ways the feedback can be applied on the use case diagram. </w:t>
-      </w:r>
+        <w:t>Responses have been provided by Sukhmanvir Atwal on 0</w:t>
+      </w:r>
+      <w:r>
+        <w:rPr>
+          <w:i/>
+          <w:iCs/>
+        </w:rPr>
+        <w:t>8</w:t>
+      </w:r>
+      <w:r>
+        <w:rPr>
+          <w:i/>
+          <w:iCs/>
+        </w:rPr>
+        <w:t xml:space="preserve">/02/2026. </w:t>
+      </w:r>
+    </w:p>
+    <w:p>
+      <w:pPr>
+        <w:rPr>
+          <w:i/>
+          <w:iCs/>
+        </w:rPr>
+      </w:pPr>
+      <w:r>
+        <w:rPr>
+          <w:i/>
+          <w:iCs/>
+        </w:rPr>
+        <w:t xml:space="preserve">Further feedback provided by Sukhmanvir Atwal on 08/02/2026. </w:t>
+      </w:r>
+    </w:p>
+    <w:p>
+      <w:pPr>
+        <w:rPr>
+          <w:i/>
+          <w:iCs/>
+        </w:rPr>
+      </w:pPr>
     </w:p>
     <w:sectPr>
       <w:pgSz w:w="11906" w:h="16838"/>

</xml_diff>